<commit_message>
Add CPU-verified dropout SwiGLU final candidate
</commit_message>
<xml_diff>
--- a/report/MP1_Report_source.docx
+++ b/report/MP1_Report_source.docx
@@ -151,7 +151,7 @@
     </w:p>
     <w:p>
       <w:r>
-        <w:t>I first reproduced the supplied causal language-model baseline and then changed one component at a time. My main modification replaces the GELU feed-forward sublayer with a parameter-matched SwiGLU gate. At the same training budget, validation BPB improved from 2.071083 to 2.010852. I then trained a wider version of the selected design for longer. The frozen final model reached 1.710366 validation BPB and 1.738670 test BPB, which is 17.26% lower than the reproduced baseline test result. I use the matched run to analyse the architectural change and the wider run only as the final quality-cost trade-off.</w:t>
+        <w:t>I first reproduced the supplied causal language-model baseline and then changed one component at a time. My main modification replaces the GELU feed-forward sublayer with a parameter-matched SwiGLU gate. At the same training budget, validation BPB improved from 2.071083 to 2.010852. I then trained a wider, deeper SwiGLU model with dropout for longer. The frozen final model reached 1.567424 validation BPB and 1.589531 CPU FP32 test BPB, which is 24.35% lower than the reproduced baseline test result. I use the matched run to analyse the architectural change and the larger run as the final quality-cost trade-off.</w:t>
       </w:r>
     </w:p>
     <w:tbl>
@@ -208,17 +208,7 @@
             <w:vAlign w:val="center"/>
           </w:tcPr>
           <w:p>
-            <w:pPr>
-              <w:spacing w:before="0" w:after="0" w:line="240" w:lineRule="auto"/>
-            </w:pPr>
             <w:r>
-              <w:rPr>
-                <w:rFonts w:ascii="Calibri" w:hAnsi="Calibri"/>
-                <w:b/>
-                <w:i w:val="0"/>
-                <w:color w:val="000000"/>
-                <w:sz w:val="17"/>
-              </w:rPr>
               <w:t>Final test BPB</w:t>
             </w:r>
           </w:p>
@@ -236,17 +226,7 @@
             <w:vAlign w:val="center"/>
           </w:tcPr>
           <w:p>
-            <w:pPr>
-              <w:spacing w:before="0" w:after="0" w:line="240" w:lineRule="auto"/>
-            </w:pPr>
             <w:r>
-              <w:rPr>
-                <w:rFonts w:ascii="Calibri" w:hAnsi="Calibri"/>
-                <w:b/>
-                <w:i w:val="0"/>
-                <w:color w:val="000000"/>
-                <w:sz w:val="17"/>
-              </w:rPr>
               <w:t>CPU score time</w:t>
             </w:r>
           </w:p>
@@ -264,17 +244,7 @@
             <w:vAlign w:val="center"/>
           </w:tcPr>
           <w:p>
-            <w:pPr>
-              <w:spacing w:before="0" w:after="0" w:line="240" w:lineRule="auto"/>
-            </w:pPr>
             <w:r>
-              <w:rPr>
-                <w:rFonts w:ascii="Calibri" w:hAnsi="Calibri"/>
-                <w:b/>
-                <w:i w:val="0"/>
-                <w:color w:val="000000"/>
-                <w:sz w:val="17"/>
-              </w:rPr>
               <w:t>Peak RAM</w:t>
             </w:r>
           </w:p>
@@ -292,17 +262,7 @@
             <w:vAlign w:val="center"/>
           </w:tcPr>
           <w:p>
-            <w:pPr>
-              <w:spacing w:before="0" w:after="0" w:line="240" w:lineRule="auto"/>
-            </w:pPr>
             <w:r>
-              <w:rPr>
-                <w:rFonts w:ascii="Calibri" w:hAnsi="Calibri"/>
-                <w:b/>
-                <w:i w:val="0"/>
-                <w:color w:val="000000"/>
-                <w:sz w:val="17"/>
-              </w:rPr>
               <w:t>Inference assets</w:t>
             </w:r>
           </w:p>
@@ -337,18 +297,8 @@
             <w:vAlign w:val="center"/>
           </w:tcPr>
           <w:p>
-            <w:pPr>
-              <w:spacing w:before="0" w:after="0" w:line="240" w:lineRule="auto"/>
-            </w:pPr>
             <w:r>
-              <w:rPr>
-                <w:rFonts w:ascii="Calibri" w:hAnsi="Calibri"/>
-                <w:b w:val="0"/>
-                <w:i w:val="0"/>
-                <w:color w:val="000000"/>
-                <w:sz w:val="17"/>
-              </w:rPr>
-              <w:t>1.738670</w:t>
+              <w:t>1.589531</w:t>
             </w:r>
           </w:p>
         </w:tc>
@@ -364,18 +314,8 @@
             <w:vAlign w:val="center"/>
           </w:tcPr>
           <w:p>
-            <w:pPr>
-              <w:spacing w:before="0" w:after="0" w:line="240" w:lineRule="auto"/>
-            </w:pPr>
             <w:r>
-              <w:rPr>
-                <w:rFonts w:ascii="Calibri" w:hAnsi="Calibri"/>
-                <w:b w:val="0"/>
-                <w:i w:val="0"/>
-                <w:color w:val="000000"/>
-                <w:sz w:val="17"/>
-              </w:rPr>
-              <w:t>19.93 s (1.48x)</w:t>
+              <w:t>42.99 s (3.19x)</w:t>
             </w:r>
           </w:p>
         </w:tc>
@@ -391,18 +331,8 @@
             <w:vAlign w:val="center"/>
           </w:tcPr>
           <w:p>
-            <w:pPr>
-              <w:spacing w:before="0" w:after="0" w:line="240" w:lineRule="auto"/>
-            </w:pPr>
             <w:r>
-              <w:rPr>
-                <w:rFonts w:ascii="Calibri" w:hAnsi="Calibri"/>
-                <w:b w:val="0"/>
-                <w:i w:val="0"/>
-                <w:color w:val="000000"/>
-                <w:sz w:val="17"/>
-              </w:rPr>
-              <w:t>1.5333 GiB</w:t>
+              <w:t>CPU evaluator: 0 CUDA GB</w:t>
             </w:r>
           </w:p>
         </w:tc>
@@ -418,18 +348,8 @@
             <w:vAlign w:val="center"/>
           </w:tcPr>
           <w:p>
-            <w:pPr>
-              <w:spacing w:before="0" w:after="0" w:line="240" w:lineRule="auto"/>
-            </w:pPr>
             <w:r>
-              <w:rPr>
-                <w:rFonts w:ascii="Calibri" w:hAnsi="Calibri"/>
-                <w:b w:val="0"/>
-                <w:i w:val="0"/>
-                <w:color w:val="000000"/>
-                <w:sz w:val="17"/>
-              </w:rPr>
-              <w:t>8.5041 MiB</w:t>
+              <w:t>21.45 MB checkpoint</w:t>
             </w:r>
           </w:p>
         </w:tc>
@@ -616,14 +536,7 @@
     </w:p>
     <w:p>
       <w:r>
-        <w:rPr>
-          <w:rFonts w:ascii="Calibri" w:hAnsi="Calibri"/>
-          <w:b w:val="0"/>
-          <w:i w:val="0"/>
-          <w:color w:val="000000"/>
-          <w:sz w:val="22"/>
-        </w:rPr>
-        <w:t>After the controlled SwiGLU model improved validation, I froze the mechanism choice and allocated additional allowed training/model capacity to the final candidate: width 192, six heads, four blocks and SwiGLU hidden width 512. It has 2,223,232 parameters and trains for 3,600 updates (29,491,200 targets). This model intentionally changes both width and training duration, so it is a final quality/cost optimization rather than evidence that isolates SwiGLU.</w:t>
+        <w:t>After the controlled SwiGLU model improved validation, I froze the mechanism choice and allocated additional capacity and regularisation to the final candidate: width 256, eight heads, six blocks, SwiGLU hidden width 688 and dropout 0.1. It has 5,355,584 parameters and trains for 12,000 updates (98,304,000 targets). Training used a local GPU for speed, but the ranked result was measured on CPU FP32. This model intentionally changes width, depth, dropout and training duration, so it is a final quality/cost optimization rather than evidence that isolates SwiGLU.</w:t>
       </w:r>
     </w:p>
     <w:p>
@@ -1241,18 +1154,8 @@
             <w:vAlign w:val="center"/>
           </w:tcPr>
           <w:p>
-            <w:pPr>
-              <w:spacing w:before="0" w:after="0" w:line="240" w:lineRule="auto"/>
-            </w:pPr>
             <w:r>
-              <w:rPr>
-                <w:rFonts w:ascii="Calibri" w:hAnsi="Calibri"/>
-                <w:b w:val="0"/>
-                <w:i w:val="0"/>
-                <w:color w:val="000000"/>
-                <w:sz w:val="17"/>
-              </w:rPr>
-              <w:t>Final SwiGLU</w:t>
+              <w:t>Final SwiGLU + dropout</w:t>
             </w:r>
           </w:p>
         </w:tc>
@@ -1268,18 +1171,8 @@
             <w:vAlign w:val="center"/>
           </w:tcPr>
           <w:p>
-            <w:pPr>
-              <w:spacing w:before="0" w:after="0" w:line="240" w:lineRule="auto"/>
-            </w:pPr>
             <w:r>
-              <w:rPr>
-                <w:rFonts w:ascii="Calibri" w:hAnsi="Calibri"/>
-                <w:b w:val="0"/>
-                <w:i w:val="0"/>
-                <w:color w:val="000000"/>
-                <w:sz w:val="17"/>
-              </w:rPr>
-              <w:t>192 / 6</w:t>
+              <w:t>256 / 8</w:t>
             </w:r>
           </w:p>
         </w:tc>
@@ -1295,18 +1188,8 @@
             <w:vAlign w:val="center"/>
           </w:tcPr>
           <w:p>
-            <w:pPr>
-              <w:spacing w:before="0" w:after="0" w:line="240" w:lineRule="auto"/>
-            </w:pPr>
             <w:r>
-              <w:rPr>
-                <w:rFonts w:ascii="Calibri" w:hAnsi="Calibri"/>
-                <w:b w:val="0"/>
-                <w:i w:val="0"/>
-                <w:color w:val="000000"/>
-                <w:sz w:val="17"/>
-              </w:rPr>
-              <w:t>3,600</w:t>
+              <w:t>12,000</w:t>
             </w:r>
           </w:p>
         </w:tc>
@@ -1322,18 +1205,8 @@
             <w:vAlign w:val="center"/>
           </w:tcPr>
           <w:p>
-            <w:pPr>
-              <w:spacing w:before="0" w:after="0" w:line="240" w:lineRule="auto"/>
-            </w:pPr>
             <w:r>
-              <w:rPr>
-                <w:rFonts w:ascii="Calibri" w:hAnsi="Calibri"/>
-                <w:b w:val="0"/>
-                <w:i w:val="0"/>
-                <w:color w:val="000000"/>
-                <w:sz w:val="17"/>
-              </w:rPr>
-              <w:t>29,491,200</w:t>
+              <w:t>98,304,000</w:t>
             </w:r>
           </w:p>
         </w:tc>
@@ -1349,18 +1222,8 @@
             <w:vAlign w:val="center"/>
           </w:tcPr>
           <w:p>
-            <w:pPr>
-              <w:spacing w:before="0" w:after="0" w:line="240" w:lineRule="auto"/>
-            </w:pPr>
             <w:r>
-              <w:rPr>
-                <w:rFonts w:ascii="Calibri" w:hAnsi="Calibri"/>
-                <w:b w:val="0"/>
-                <w:i w:val="0"/>
-                <w:color w:val="000000"/>
-                <w:sz w:val="17"/>
-              </w:rPr>
-              <w:t>2,223,232</w:t>
+              <w:t>5,355,584</w:t>
             </w:r>
           </w:p>
         </w:tc>
@@ -1376,17 +1239,7 @@
             <w:vAlign w:val="center"/>
           </w:tcPr>
           <w:p>
-            <w:pPr>
-              <w:spacing w:before="0" w:after="0" w:line="240" w:lineRule="auto"/>
-            </w:pPr>
             <w:r>
-              <w:rPr>
-                <w:rFonts w:ascii="Calibri" w:hAnsi="Calibri"/>
-                <w:b w:val="0"/>
-                <w:i w:val="0"/>
-                <w:color w:val="000000"/>
-                <w:sz w:val="17"/>
-              </w:rPr>
               <w:t>Frozen score</w:t>
             </w:r>
           </w:p>
@@ -1395,14 +1248,7 @@
     </w:tbl>
     <w:p>
       <w:r>
-        <w:rPr>
-          <w:rFonts w:ascii="Calibri" w:hAnsi="Calibri"/>
-          <w:b w:val="0"/>
-          <w:i w:val="0"/>
-          <w:color w:val="000000"/>
-          <w:sz w:val="22"/>
-        </w:rPr>
-        <w:t>All runs use seed 17, context 256, AdamW with the supplied schedule, gradient clipping and only the supplied training text. The fixed evaluator and tokenizer are unchanged. The 1,200-step pair is the required same-target comparison and key-mechanism ablation. The final model is selected solely because its 1.710366 validation BPB is lower than both controlled runs.</w:t>
+        <w:t>All runs use seed 17, context 256, AdamW with the supplied schedule, gradient clipping and only the supplied training text. The fixed evaluator and tokenizer are unchanged. The 1,200-step pair is the required same-target comparison and key-mechanism ablation. The final model is selected solely because its 1.567424 validation BPB is lower than the earlier candidates.</w:t>
       </w:r>
     </w:p>
     <w:p>
@@ -2024,18 +1870,8 @@
             <w:vAlign w:val="center"/>
           </w:tcPr>
           <w:p>
-            <w:pPr>
-              <w:spacing w:before="0" w:after="0" w:line="240" w:lineRule="auto"/>
-            </w:pPr>
             <w:r>
-              <w:rPr>
-                <w:rFonts w:ascii="Calibri" w:hAnsi="Calibri"/>
-                <w:b w:val="0"/>
-                <w:i w:val="0"/>
-                <w:color w:val="000000"/>
-                <w:sz w:val="17"/>
-              </w:rPr>
-              <w:t>Final SwiGLU</w:t>
+              <w:t>Final SwiGLU + dropout</w:t>
             </w:r>
           </w:p>
         </w:tc>
@@ -2051,18 +1887,8 @@
             <w:vAlign w:val="center"/>
           </w:tcPr>
           <w:p>
-            <w:pPr>
-              <w:spacing w:before="0" w:after="0" w:line="240" w:lineRule="auto"/>
-            </w:pPr>
             <w:r>
-              <w:rPr>
-                <w:rFonts w:ascii="Calibri" w:hAnsi="Calibri"/>
-                <w:b w:val="0"/>
-                <w:i w:val="0"/>
-                <w:color w:val="000000"/>
-                <w:sz w:val="17"/>
-              </w:rPr>
-              <w:t>1.710366</w:t>
+              <w:t>1.567424</w:t>
             </w:r>
           </w:p>
         </w:tc>
@@ -2078,18 +1904,8 @@
             <w:vAlign w:val="center"/>
           </w:tcPr>
           <w:p>
-            <w:pPr>
-              <w:spacing w:before="0" w:after="0" w:line="240" w:lineRule="auto"/>
-            </w:pPr>
             <w:r>
-              <w:rPr>
-                <w:rFonts w:ascii="Calibri" w:hAnsi="Calibri"/>
-                <w:b w:val="0"/>
-                <w:i w:val="0"/>
-                <w:color w:val="000000"/>
-                <w:sz w:val="17"/>
-              </w:rPr>
-              <w:t>1.738670</w:t>
+              <w:t>1.589531</w:t>
             </w:r>
           </w:p>
         </w:tc>
@@ -2105,18 +1921,8 @@
             <w:vAlign w:val="center"/>
           </w:tcPr>
           <w:p>
-            <w:pPr>
-              <w:spacing w:before="0" w:after="0" w:line="240" w:lineRule="auto"/>
-            </w:pPr>
             <w:r>
-              <w:rPr>
-                <w:rFonts w:ascii="Calibri" w:hAnsi="Calibri"/>
-                <w:b w:val="0"/>
-                <w:i w:val="0"/>
-                <w:color w:val="000000"/>
-                <w:sz w:val="17"/>
-              </w:rPr>
-              <w:t>3,483.08 s</w:t>
+              <w:t>2,207.84 s GPU</w:t>
             </w:r>
           </w:p>
         </w:tc>
@@ -2132,18 +1938,8 @@
             <w:vAlign w:val="center"/>
           </w:tcPr>
           <w:p>
-            <w:pPr>
-              <w:spacing w:before="0" w:after="0" w:line="240" w:lineRule="auto"/>
-            </w:pPr>
             <w:r>
-              <w:rPr>
-                <w:rFonts w:ascii="Calibri" w:hAnsi="Calibri"/>
-                <w:b w:val="0"/>
-                <w:i w:val="0"/>
-                <w:color w:val="000000"/>
-                <w:sz w:val="17"/>
-              </w:rPr>
-              <w:t>19.93 s</w:t>
+              <w:t>42.99 s CPU</w:t>
             </w:r>
           </w:p>
         </w:tc>
@@ -2159,18 +1955,8 @@
             <w:vAlign w:val="center"/>
           </w:tcPr>
           <w:p>
-            <w:pPr>
-              <w:spacing w:before="0" w:after="0" w:line="240" w:lineRule="auto"/>
-            </w:pPr>
             <w:r>
-              <w:rPr>
-                <w:rFonts w:ascii="Calibri" w:hAnsi="Calibri"/>
-                <w:b w:val="0"/>
-                <w:i w:val="0"/>
-                <w:color w:val="000000"/>
-                <w:sz w:val="17"/>
-              </w:rPr>
-              <w:t>373b88...7dcc</w:t>
+              <w:t>90163a...7802</w:t>
             </w:r>
           </w:p>
         </w:tc>
@@ -2305,7 +2091,7 @@
     </w:p>
     <w:p>
       <w:r>
-        <w:t>The final model improves validation by 0.360717 BPB (17.42%) and test by 0.362590 BPB (17.26%) relative to baseline. It uses 2.04x parameters, 3x processed targets and 4.52x training time. The inference increase is smaller: 19.93 s is 1.48x the locally reproduced baseline CPU scoring time. A repeated resource-instrumented pass reproduced exactly the same test BPB in 20.06 s, with 1.5333 GiB peak process-tree working set. Required checkpoint, code and configuration assets total 8.5041 MiB. The model therefore stays below all three limits, although the quality gain required noticeably more training.</w:t>
+        <w:t>The final model improves validation by 0.503660 BPB (24.32%) and test by 0.511730 BPB (24.35%) relative to baseline. It uses 4.92x parameters, 10x processed targets and 2,207.84 s of GPU training. The final CPU FP32 test took 42.99 s, or 3.19x the locally reproduced baseline, below the 5x limit. The checkpoint is 21.45 MB and the evaluator reports zero CUDA allocation because scoring was CPU-only. The quality gain therefore comes with a substantial training cost but remains within the stated inference-time and asset limits.</w:t>
       </w:r>
     </w:p>
     <w:p>
@@ -2356,14 +2142,7 @@
     </w:p>
     <w:p>
       <w:r>
-        <w:rPr>
-          <w:rFonts w:ascii="Calibri" w:hAnsi="Calibri"/>
-          <w:b w:val="0"/>
-          <w:i w:val="0"/>
-          <w:color w:val="000000"/>
-          <w:sz w:val="22"/>
-        </w:rPr>
-        <w:t>The final model improves validation by 0.360717 BPB (17.42%) and test by 0.362590 BPB (17.26%) relative to baseline. It uses 2.04x parameters, 3x processed targets and 4.52x training time. The inference trade-off is smaller: 19.93 s is 1.48x baseline CPU scoring time. A repeated resource-instrumented pass reproduced the exact test BPB in 20.06 s, with 1.5333 GiB peak process-tree working set. Required checkpoint/code/config assets total 8.5041 MiB. These are below the 5x time, 4 GiB RAM and 64 MiB asset limits.</w:t>
+        <w:t>The final model improves validation by 0.503660 BPB (24.32%) and test by 0.511730 BPB (24.35%) relative to baseline. It uses 4.92x parameters and 10x processed targets. CPU FP32 scoring took 42.99 s, or 3.19x baseline, below the 5x time limit. The checkpoint is 21.45 MB, below the 64 MiB asset limit; the final evaluator run was CPU-only and therefore reports zero CUDA allocation.</w:t>
       </w:r>
     </w:p>
     <w:tbl>
@@ -2609,18 +2388,8 @@
             <w:vAlign w:val="center"/>
           </w:tcPr>
           <w:p>
-            <w:pPr>
-              <w:spacing w:before="0" w:after="0" w:line="240" w:lineRule="auto"/>
-            </w:pPr>
             <w:r>
-              <w:rPr>
-                <w:rFonts w:ascii="Calibri" w:hAnsi="Calibri"/>
-                <w:b w:val="0"/>
-                <w:i w:val="0"/>
-                <w:color w:val="000000"/>
-                <w:sz w:val="17"/>
-              </w:rPr>
-              <w:t>1.48x</w:t>
+              <w:t>3.19x</w:t>
             </w:r>
           </w:p>
         </w:tc>
@@ -2735,18 +2504,8 @@
             <w:vAlign w:val="center"/>
           </w:tcPr>
           <w:p>
-            <w:pPr>
-              <w:spacing w:before="0" w:after="0" w:line="240" w:lineRule="auto"/>
-            </w:pPr>
             <w:r>
-              <w:rPr>
-                <w:rFonts w:ascii="Calibri" w:hAnsi="Calibri"/>
-                <w:b w:val="0"/>
-                <w:i w:val="0"/>
-                <w:color w:val="000000"/>
-                <w:sz w:val="17"/>
-              </w:rPr>
-              <w:t>1.5333 GiB</w:t>
+              <w:t>CPU evaluator: 0 CUDA GB</w:t>
             </w:r>
           </w:p>
         </w:tc>
@@ -2762,18 +2521,8 @@
             <w:vAlign w:val="center"/>
           </w:tcPr>
           <w:p>
-            <w:pPr>
-              <w:spacing w:before="0" w:after="0" w:line="240" w:lineRule="auto"/>
-            </w:pPr>
             <w:r>
-              <w:rPr>
-                <w:rFonts w:ascii="Calibri" w:hAnsi="Calibri"/>
-                <w:b w:val="0"/>
-                <w:i w:val="0"/>
-                <w:color w:val="000000"/>
-                <w:sz w:val="17"/>
-              </w:rPr>
-              <w:t>Pass</w:t>
+              <w:t>CPU-only run</w:t>
             </w:r>
           </w:p>
         </w:tc>
@@ -2807,17 +2556,7 @@
             <w:vAlign w:val="center"/>
           </w:tcPr>
           <w:p>
-            <w:pPr>
-              <w:spacing w:before="0" w:after="0" w:line="240" w:lineRule="auto"/>
-            </w:pPr>
             <w:r>
-              <w:rPr>
-                <w:rFonts w:ascii="Calibri" w:hAnsi="Calibri"/>
-                <w:b w:val="0"/>
-                <w:i w:val="0"/>
-                <w:color w:val="000000"/>
-                <w:sz w:val="17"/>
-              </w:rPr>
               <w:t>Inference assets</w:t>
             </w:r>
           </w:p>
@@ -2834,17 +2573,7 @@
             <w:vAlign w:val="center"/>
           </w:tcPr>
           <w:p>
-            <w:pPr>
-              <w:spacing w:before="0" w:after="0" w:line="240" w:lineRule="auto"/>
-            </w:pPr>
             <w:r>
-              <w:rPr>
-                <w:rFonts w:ascii="Calibri" w:hAnsi="Calibri"/>
-                <w:b w:val="0"/>
-                <w:i w:val="0"/>
-                <w:color w:val="000000"/>
-                <w:sz w:val="17"/>
-              </w:rPr>
               <w:t>&lt;= 64 MiB</w:t>
             </w:r>
           </w:p>
@@ -2861,18 +2590,8 @@
             <w:vAlign w:val="center"/>
           </w:tcPr>
           <w:p>
-            <w:pPr>
-              <w:spacing w:before="0" w:after="0" w:line="240" w:lineRule="auto"/>
-            </w:pPr>
             <w:r>
-              <w:rPr>
-                <w:rFonts w:ascii="Calibri" w:hAnsi="Calibri"/>
-                <w:b w:val="0"/>
-                <w:i w:val="0"/>
-                <w:color w:val="000000"/>
-                <w:sz w:val="17"/>
-              </w:rPr>
-              <w:t>8.5041 MiB</w:t>
+              <w:t>21.45 MB checkpoint</w:t>
             </w:r>
           </w:p>
         </w:tc>
@@ -2888,17 +2607,7 @@
             <w:vAlign w:val="center"/>
           </w:tcPr>
           <w:p>
-            <w:pPr>
-              <w:spacing w:before="0" w:after="0" w:line="240" w:lineRule="auto"/>
-            </w:pPr>
             <w:r>
-              <w:rPr>
-                <w:rFonts w:ascii="Calibri" w:hAnsi="Calibri"/>
-                <w:b w:val="0"/>
-                <w:i w:val="0"/>
-                <w:color w:val="000000"/>
-                <w:sz w:val="17"/>
-              </w:rPr>
               <w:t>Pass</w:t>
             </w:r>
           </w:p>
@@ -3043,44 +2752,19 @@
         <w:ind w:left="259" w:right="259"/>
       </w:pPr>
       <w:r>
-        <w:rPr>
-          <w:rFonts w:ascii="Consolas" w:hAnsi="Consolas"/>
-          <w:b w:val="0"/>
-          <w:i w:val="0"/>
-          <w:color w:val="000000"/>
-          <w:sz w:val="17"/>
-        </w:rPr>
-        <w:t>python train.py --implementation student --config configs/swiglu_192.json --device cpu --precision fp32 --threads 4 --seed 17 --steps 3600 --batch-size 32 --run-dir runs/swiglu192-final3600-s17</w:t>
-      </w:r>
-      <w:r>
-        <w:rPr>
-          <w:rFonts w:ascii="Consolas" w:hAnsi="Consolas"/>
-          <w:b w:val="0"/>
-          <w:i w:val="0"/>
-          <w:color w:val="000000"/>
-          <w:sz w:val="17"/>
-        </w:rPr>
-        <w:br w:type="textWrapping"/>
-      </w:r>
-      <w:r>
-        <w:rPr>
-          <w:rFonts w:ascii="Consolas" w:hAnsi="Consolas"/>
-          <w:b w:val="0"/>
-          <w:i w:val="0"/>
-          <w:color w:val="000000"/>
-          <w:sz w:val="17"/>
-        </w:rPr>
-        <w:t>python evaluate.py --checkpoint runs/swiglu192-final3600-s17/checkpoint.pt --device cpu --precision fp32 --threads 4 --split test</w:t>
+        <w:t>python train.py --implementation student --config configs/swiglu_256x6_dropout.json --device cuda --precision fp32 --threads 4 --seed 17 --steps 12000 --batch-size 32 --eval-every 2000 --run-dir runs/swiglu256x6-dropout10-final12000-s17</w:t>
+        <w:br/>
+        <w:t>python evaluate.py --checkpoint runs/swiglu256x6-dropout10-final12000-s17/checkpoint.pt --device cpu --precision fp32 --threads 4 --split test</w:t>
       </w:r>
     </w:p>
     <w:p>
       <w:r>
-        <w:t>SHA-256 is a file fingerprint, not an accuracy score. If even one byte of a checkpoint changes, its SHA-256 value changes. Recording the fingerprint lets the evaluator check that the downloaded file is exactly the checkpoint used for the reported result. The results table shortens each value for readability: 7d869d...6d3f identifies the baseline checkpoint, a555a3...3c94 identifies the matched validation-only checkpoint, and 373b88...7dcc identifies the frozen final checkpoint. Only the final checkpoint is needed for the ranked submission.</w:t>
+        <w:t>SHA-256 is a file fingerprint, not an accuracy score. If even one byte of a checkpoint changes, its SHA-256 value changes. Recording the fingerprint lets the evaluator check that the downloaded file is exactly the checkpoint used for the reported result. The results table shortens each value for readability: 7d869d...6d3f identifies the baseline checkpoint, a555a3...3c94 identifies the matched validation-only checkpoint, 373b88...7dcc identifies the earlier frozen checkpoint, and 90163a...7802 identifies the current frozen checkpoint.</w:t>
       </w:r>
     </w:p>
     <w:p>
       <w:r>
-        <w:t>The complete frozen-final checkpoint SHA-256 is 373b884e4daec5c99ad2e0645106ead62580b68c2b07a0eb2220e3c7c1c87dcc. The supporting student_model.py SHA-256 is b8bd352f7cb14832536882a0b4fea4308e3d8371443cadef6a5179ba3af63ad4.</w:t>
+        <w:t>The complete current frozen-final checkpoint SHA-256 is 90163aed08c92f1affce1830907e63a62ef0b01ec32327c82a71088f8c747802. The current supporting student_model.py is included in the repository and checkpoint bundle.</w:t>
       </w:r>
     </w:p>
     <w:p>
@@ -3093,7 +2777,7 @@
     </w:p>
     <w:p>
       <w:r>
-        <w:t>The controlled experiment answers my main question: at nearly the same parameter count and exactly the same target budget, the SwiGLU version achieved lower validation BPB than the supplied GELU MLP. The wider, longer-trained version then reached 1.738670 test BPB while remaining within the evaluation limits. The experiments do not show that gating alone caused the entire final improvement, but they separate the evidence for the gate from the later decision to spend more model and training capacity.</w:t>
+        <w:t>The controlled experiment answers my main question: at nearly the same parameter count and exactly the same target budget, the SwiGLU version achieved lower validation BPB than the supplied GELU MLP. The wider, longer-trained and regularised version then reached 1.589531 CPU FP32 test BPB while remaining below the 5x scoring-time and 64 MiB asset limits. The experiments do not show that gating alone caused the entire final improvement, but they separate the evidence for the gate from the later decision to spend more model and training capacity.</w:t>
       </w:r>
     </w:p>
     <w:p>

</xml_diff>

<commit_message>
Correct final report figures and resource evidence
</commit_message>
<xml_diff>
--- a/report/MP1_Report_source.docx
+++ b/report/MP1_Report_source.docx
@@ -22,14 +22,7 @@
         <w:spacing w:after="280"/>
       </w:pPr>
       <w:r>
-        <w:rPr>
-          <w:rFonts w:ascii="Calibri" w:hAnsi="Calibri"/>
-          <w:b w:val="0"/>
-          <w:i w:val="0"/>
-          <w:color w:val="666666"/>
-          <w:sz w:val="28"/>
-        </w:rPr>
-        <w:t>Parameter-Matched SwiGLU and Capacity Scaling</w:t>
+        <w:t>Parameter-Matched SwiGLU with Capacity Scaling and Dropout</w:t>
       </w:r>
     </w:p>
     <w:p>
@@ -332,7 +325,7 @@
           </w:tcPr>
           <w:p>
             <w:r>
-              <w:t>CPU evaluator: 0 CUDA GB</w:t>
+              <w:t>1.4972 GiB</w:t>
             </w:r>
           </w:p>
         </w:tc>
@@ -349,7 +342,7 @@
           </w:tcPr>
           <w:p>
             <w:r>
-              <w:t>21.45 MB checkpoint</w:t>
+              <w:t>20.46 MiB total</w:t>
             </w:r>
           </w:p>
         </w:tc>
@@ -2013,14 +2006,7 @@
         <w:jc w:val="center"/>
       </w:pPr>
       <w:r>
-        <w:rPr>
-          <w:rFonts w:ascii="Calibri" w:hAnsi="Calibri"/>
-          <w:b w:val="0"/>
-          <w:i/>
-          <w:color w:val="666666"/>
-          <w:sz w:val="18"/>
-        </w:rPr>
-        <w:t>Figure 1. Logged training losses. The matched pair shares the same step budget; the wider final run continues to 3,600 updates.</w:t>
+        <w:t>Figure 1. Logged training losses. The matched pair shares the same 1,200-step budget; the final dropout run continues to 12,000 updates.</w:t>
       </w:r>
     </w:p>
     <w:p>
@@ -2091,7 +2077,7 @@
     </w:p>
     <w:p>
       <w:r>
-        <w:t>The final model improves validation by 0.503660 BPB (24.32%) and test by 0.511730 BPB (24.35%) relative to baseline. It uses 4.92x parameters, 10x processed targets and 2,207.84 s of GPU training. The final CPU FP32 test took 42.99 s, or 3.19x the locally reproduced baseline, below the 5x limit. The checkpoint is 21.45 MB and the evaluator reports zero CUDA allocation because scoring was CPU-only. The quality gain therefore comes with a substantial training cost but remains within the stated inference-time and asset limits.</w:t>
+        <w:t>The final model improves validation by 0.503660 BPB (24.32%) and test by 0.511730 BPB (24.35%) relative to baseline. It uses 4.92x parameters, 10x processed targets and 2,207.84 s of GPU training. The final CPU FP32 test took 42.99 s, or 3.19x the locally reproduced baseline. Peak process-tree working set was 1.4972 GiB, and all required inference assets total 20.46 MiB. The model passes the 5x time, 4 GiB RAM and 64 MiB asset limits; the quality gain comes with a substantial training cost.</w:t>
       </w:r>
     </w:p>
     <w:p>
@@ -2142,7 +2128,7 @@
     </w:p>
     <w:p>
       <w:r>
-        <w:t>The final model improves validation by 0.503660 BPB (24.32%) and test by 0.511730 BPB (24.35%) relative to baseline. It uses 4.92x parameters and 10x processed targets. CPU FP32 scoring took 42.99 s, or 3.19x baseline, below the 5x time limit. The checkpoint is 21.45 MB, below the 64 MiB asset limit; the final evaluator run was CPU-only and therefore reports zero CUDA allocation.</w:t>
+        <w:t>The final model improves validation by 0.503660 BPB (24.32%) and test by 0.511730 BPB (24.35%) relative to baseline. It uses 4.92x parameters and 10x processed targets. CPU FP32 scoring took 42.99 s, or 3.19x baseline, below the 5x time limit. Peak process-tree working set was 1.4972 GiB. The checkpoint, student implementation and configuration total 20.46 MiB. These measurements remain below the 4 GiB RAM and 64 MiB asset limits.</w:t>
       </w:r>
     </w:p>
     <w:tbl>
@@ -2505,7 +2491,7 @@
           </w:tcPr>
           <w:p>
             <w:r>
-              <w:t>CPU evaluator: 0 CUDA GB</w:t>
+              <w:t>1.4972 GiB</w:t>
             </w:r>
           </w:p>
         </w:tc>
@@ -2522,7 +2508,7 @@
           </w:tcPr>
           <w:p>
             <w:r>
-              <w:t>CPU-only run</w:t>
+              <w:t>Pass</w:t>
             </w:r>
           </w:p>
         </w:tc>
@@ -2591,7 +2577,7 @@
           </w:tcPr>
           <w:p>
             <w:r>
-              <w:t>21.45 MB checkpoint</w:t>
+              <w:t>20.46 MiB total</w:t>
             </w:r>
           </w:p>
         </w:tc>

</xml_diff>